<commit_message>
Clarify EXP4 analysis provenance and thesis artifacts
Mark EXP4 as completed as an LLM-based semantic proxy and point to generated analysis artifacts as the canonical source (`outputs/analysis/exp4_llm_evaluation/exp4_analysis_summary.json`). Update EXP4 docs (IMPLEMENTATION_STATUS, QUICK_REFERENCE, README, openrouter_full_replicated_results) to note the multi-judge synthesis, historical single-judge snapshot, and that human validation remains a future calibration step. Revise thesis chapters and appendices to enforce traceability to generated analysis outputs, update prompts/storage paths for EXP4, adjust citations (add Brown 2020 and other refs), and regenerate the Word output (docx) while removing the PDF snapshot. Add a VS Code workspace file and a couple of small new files; update thesis template asset and references.bib with multiple bibliography additions.
</commit_message>
<xml_diff>
--- a/thesis/assets/Plantilla_Tesis_Doctorado.docx
+++ b/thesis/assets/Plantilla_Tesis_Doctorado.docx
@@ -20565,7 +20565,7 @@
 </file>
 
 <file path=word/styles.xml><?xml version="1.0" encoding="utf-8"?>
-<w:styles xmlns:r="http://schemas.openxmlformats.org/officeDocument/2006/relationships" xmlns:w="http://schemas.openxmlformats.org/wordprocessingml/2006/main">
+<w:styles xmlns:w="http://schemas.openxmlformats.org/wordprocessingml/2006/main">
   <w:docDefaults>
     <w:rPrDefault>
       <w:rPr>
@@ -20577,7 +20577,8 @@
     </w:rPrDefault>
     <w:pPrDefault>
       <w:pPr>
-        <w:spacing w:after="160" w:line="259" w:lineRule="auto"/>
+        <w:spacing w:after="160" w:line="480" w:lineRule="auto"/>
+        <w:jc w:val="both"/>
       </w:pPr>
     </w:pPrDefault>
   </w:docDefaults>
@@ -20727,6 +20728,10 @@
     <w:rPr>
       <w:lang w:val="es-MX"/>
     </w:rPr>
+    <w:pPr>
+      <w:spacing w:line="480" w:lineRule="auto"/>
+      <w:jc w:val="both"/>
+    </w:pPr>
   </w:style>
   <w:style w:type="paragraph" w:styleId="Ttulo1">
     <w:name w:val="heading 1"/>

</xml_diff>

<commit_message>
Polish thesis auditability and formatting
</commit_message>
<xml_diff>
--- a/thesis/assets/Plantilla_Tesis_Doctorado.docx
+++ b/thesis/assets/Plantilla_Tesis_Doctorado.docx
@@ -20565,7 +20565,7 @@
 </file>
 
 <file path=word/styles.xml><?xml version="1.0" encoding="utf-8"?>
-<w:styles xmlns:r="http://schemas.openxmlformats.org/officeDocument/2006/relationships" xmlns:w="http://schemas.openxmlformats.org/wordprocessingml/2006/main">
+<w:styles xmlns:w="http://schemas.openxmlformats.org/wordprocessingml/2006/main">
   <w:docDefaults>
     <w:rPrDefault>
       <w:rPr>
@@ -20577,7 +20577,8 @@
     </w:rPrDefault>
     <w:pPrDefault>
       <w:pPr>
-        <w:spacing w:after="160" w:line="259" w:lineRule="auto"/>
+        <w:spacing w:after="160" w:line="360" w:lineRule="auto"/>
+        <w:jc w:val="both"/>
       </w:pPr>
     </w:pPrDefault>
   </w:docDefaults>
@@ -20727,6 +20728,10 @@
     <w:rPr>
       <w:lang w:val="es-MX"/>
     </w:rPr>
+    <w:pPr>
+      <w:spacing w:line="360" w:lineRule="auto"/>
+      <w:jc w:val="both"/>
+    </w:pPr>
   </w:style>
   <w:style w:type="paragraph" w:styleId="Ttulo1">
     <w:name w:val="heading 1"/>
@@ -20740,8 +20745,8 @@
     <w:pPr>
       <w:keepNext/>
       <w:keepLines/>
-      <w:spacing w:before="240" w:after="0" w:line="480" w:lineRule="auto"/>
-      <w:jc w:val="center"/>
+      <w:spacing w:before="240" w:after="0" w:line="360" w:lineRule="auto"/>
+      <w:jc w:val="both"/>
       <w:outlineLvl w:val="0"/>
     </w:pPr>
     <w:rPr>
@@ -20764,8 +20769,9 @@
     <w:pPr>
       <w:keepNext/>
       <w:keepLines/>
-      <w:spacing w:before="40" w:after="0" w:line="480" w:lineRule="auto"/>
+      <w:spacing w:before="40" w:after="0" w:line="360" w:lineRule="auto"/>
       <w:outlineLvl w:val="1"/>
+      <w:jc w:val="both"/>
     </w:pPr>
     <w:rPr>
       <w:rFonts w:eastAsia="Times New Roman" w:cs="Times New Roman"/>
@@ -20785,8 +20791,9 @@
     <w:pPr>
       <w:keepNext/>
       <w:keepLines/>
-      <w:spacing w:before="40" w:after="0"/>
+      <w:spacing w:before="40" w:after="0" w:line="360" w:lineRule="auto"/>
       <w:outlineLvl w:val="2"/>
+      <w:jc w:val="both"/>
     </w:pPr>
     <w:rPr>
       <w:rFonts w:eastAsiaTheme="majorEastAsia" w:cstheme="majorBidi"/>
@@ -20807,9 +20814,10 @@
     <w:pPr>
       <w:keepNext/>
       <w:keepLines/>
-      <w:spacing w:before="40" w:after="0"/>
+      <w:spacing w:before="40" w:after="0" w:line="360" w:lineRule="auto"/>
       <w:ind w:left="1440"/>
       <w:outlineLvl w:val="3"/>
+      <w:jc w:val="both"/>
     </w:pPr>
     <w:rPr>
       <w:rFonts w:eastAsiaTheme="majorEastAsia" w:cstheme="majorBidi"/>
@@ -20829,9 +20837,10 @@
     <w:pPr>
       <w:keepNext/>
       <w:keepLines/>
-      <w:spacing w:before="40" w:after="0"/>
+      <w:spacing w:before="40" w:after="0" w:line="360" w:lineRule="auto"/>
       <w:ind w:left="1440"/>
       <w:outlineLvl w:val="4"/>
+      <w:jc w:val="both"/>
     </w:pPr>
     <w:rPr>
       <w:rFonts w:eastAsiaTheme="majorEastAsia" w:cstheme="majorBidi"/>
@@ -20876,7 +20885,8 @@
     <w:unhideWhenUsed/>
     <w:rsid w:val="00781846"/>
     <w:pPr>
-      <w:spacing w:after="120"/>
+      <w:spacing w:after="120" w:line="360" w:lineRule="auto"/>
+      <w:jc w:val="both"/>
     </w:pPr>
   </w:style>
   <w:style w:type="character" w:customStyle="1" w:styleId="TextoindependienteCar">
@@ -20899,7 +20909,8 @@
         <w:tab w:val="center" w:pos="4680"/>
         <w:tab w:val="right" w:pos="9360"/>
       </w:tabs>
-      <w:spacing w:after="0" w:line="240" w:lineRule="auto"/>
+      <w:spacing w:after="0" w:line="360" w:lineRule="auto"/>
+      <w:jc w:val="both"/>
     </w:pPr>
   </w:style>
   <w:style w:type="character" w:customStyle="1" w:styleId="PiedepginaCar">
@@ -20921,7 +20932,8 @@
         <w:tab w:val="center" w:pos="4680"/>
         <w:tab w:val="right" w:pos="9360"/>
       </w:tabs>
-      <w:spacing w:after="0" w:line="240" w:lineRule="auto"/>
+      <w:spacing w:after="0" w:line="360" w:lineRule="auto"/>
+      <w:jc w:val="both"/>
     </w:pPr>
   </w:style>
   <w:style w:type="character" w:customStyle="1" w:styleId="EncabezadoCar">
@@ -20940,7 +20952,8 @@
     <w:unhideWhenUsed/>
     <w:rsid w:val="00D06AD2"/>
     <w:pPr>
-      <w:spacing w:after="0" w:line="240" w:lineRule="auto"/>
+      <w:spacing w:after="0" w:line="360" w:lineRule="auto"/>
+      <w:jc w:val="both"/>
     </w:pPr>
     <w:rPr>
       <w:rFonts w:ascii="Segoe UI" w:hAnsi="Segoe UI" w:cs="Segoe UI"/>
@@ -20981,6 +20994,8 @@
     <w:pPr>
       <w:ind w:left="720"/>
       <w:contextualSpacing/>
+      <w:spacing w:line="360" w:lineRule="auto"/>
+      <w:jc w:val="both"/>
     </w:pPr>
   </w:style>
   <w:style w:type="character" w:styleId="Hipervnculovisitado">
@@ -21016,7 +21031,8 @@
     <w:unhideWhenUsed/>
     <w:rsid w:val="00CC0FFA"/>
     <w:pPr>
-      <w:spacing w:line="240" w:lineRule="auto"/>
+      <w:spacing w:line="360" w:lineRule="auto"/>
+      <w:jc w:val="both"/>
     </w:pPr>
     <w:rPr>
       <w:sz w:val="20"/>
@@ -21048,6 +21064,10 @@
       <w:b/>
       <w:bCs/>
     </w:rPr>
+    <w:pPr>
+      <w:spacing w:line="360" w:lineRule="auto"/>
+      <w:jc w:val="both"/>
+    </w:pPr>
   </w:style>
   <w:style w:type="character" w:customStyle="1" w:styleId="AsuntodelcomentarioCar">
     <w:name w:val="Asunto del comentario Car"/>
@@ -21137,6 +21157,8 @@
     <w:rsid w:val="00A62C67"/>
     <w:pPr>
       <w:outlineLvl w:val="9"/>
+      <w:spacing w:line="360" w:lineRule="auto"/>
+      <w:jc w:val="both"/>
     </w:pPr>
     <w:rPr>
       <w:lang w:eastAsia="es-MX"/>
@@ -21151,8 +21173,9 @@
     <w:unhideWhenUsed/>
     <w:rsid w:val="00302EDB"/>
     <w:pPr>
-      <w:spacing w:after="100" w:line="480" w:lineRule="auto"/>
+      <w:spacing w:after="100" w:line="360" w:lineRule="auto"/>
       <w:ind w:left="482"/>
+      <w:jc w:val="both"/>
     </w:pPr>
   </w:style>
   <w:style w:type="paragraph" w:styleId="TDC1">
@@ -21164,7 +21187,8 @@
     <w:unhideWhenUsed/>
     <w:rsid w:val="00302EDB"/>
     <w:pPr>
-      <w:spacing w:after="100" w:line="480" w:lineRule="auto"/>
+      <w:spacing w:after="100" w:line="360" w:lineRule="auto"/>
+      <w:jc w:val="both"/>
     </w:pPr>
   </w:style>
   <w:style w:type="character" w:customStyle="1" w:styleId="Ttulo2Car">
@@ -21189,8 +21213,9 @@
     <w:unhideWhenUsed/>
     <w:rsid w:val="00302EDB"/>
     <w:pPr>
-      <w:spacing w:after="100" w:line="480" w:lineRule="auto"/>
+      <w:spacing w:after="100" w:line="360" w:lineRule="auto"/>
       <w:ind w:left="238"/>
+      <w:jc w:val="both"/>
     </w:pPr>
   </w:style>
   <w:style w:type="character" w:customStyle="1" w:styleId="Ttulo3Car">
@@ -21242,7 +21267,8 @@
     <w:qFormat/>
     <w:rsid w:val="002105DF"/>
     <w:pPr>
-      <w:spacing w:after="200" w:line="240" w:lineRule="auto"/>
+      <w:spacing w:after="200" w:line="360" w:lineRule="auto"/>
+      <w:jc w:val="both"/>
     </w:pPr>
     <w:rPr>
       <w:i/>
@@ -21260,7 +21286,8 @@
     <w:unhideWhenUsed/>
     <w:rsid w:val="00302EDB"/>
     <w:pPr>
-      <w:spacing w:after="0" w:line="480" w:lineRule="auto"/>
+      <w:spacing w:after="0" w:line="360" w:lineRule="auto"/>
+      <w:jc w:val="both"/>
     </w:pPr>
   </w:style>
   <w:style w:type="table" w:customStyle="1" w:styleId="APAReport">
@@ -21332,8 +21359,9 @@
     <w:unhideWhenUsed/>
     <w:rsid w:val="00302EDB"/>
     <w:pPr>
-      <w:spacing w:after="100" w:line="480" w:lineRule="auto"/>
+      <w:spacing w:after="100" w:line="360" w:lineRule="auto"/>
       <w:ind w:left="720"/>
+      <w:jc w:val="both"/>
     </w:pPr>
   </w:style>
   <w:style w:type="paragraph" w:styleId="TDC5">
@@ -21345,8 +21373,9 @@
     <w:unhideWhenUsed/>
     <w:rsid w:val="00302EDB"/>
     <w:pPr>
-      <w:spacing w:after="100" w:line="480" w:lineRule="auto"/>
+      <w:spacing w:after="100" w:line="360" w:lineRule="auto"/>
       <w:ind w:left="958"/>
+      <w:jc w:val="both"/>
     </w:pPr>
   </w:style>
   <w:style w:type="paragraph" w:customStyle="1" w:styleId="Default">
@@ -21356,7 +21385,8 @@
       <w:autoSpaceDE w:val="0"/>
       <w:autoSpaceDN w:val="0"/>
       <w:adjustRightInd w:val="0"/>
-      <w:spacing w:after="0" w:line="240" w:lineRule="auto"/>
+      <w:spacing w:after="0" w:line="360" w:lineRule="auto"/>
+      <w:jc w:val="both"/>
     </w:pPr>
     <w:rPr>
       <w:rFonts w:cs="Times New Roman"/>
@@ -21384,7 +21414,8 @@
     <w:pPr>
       <w:widowControl w:val="0"/>
       <w:shd w:val="clear" w:color="auto" w:fill="FFFFFF"/>
-      <w:spacing w:after="0" w:line="240" w:lineRule="auto"/>
+      <w:spacing w:after="0" w:line="360" w:lineRule="auto"/>
+      <w:jc w:val="both"/>
     </w:pPr>
     <w:rPr>
       <w:rFonts w:eastAsia="Times New Roman" w:cs="Times New Roman"/>

</xml_diff>